<commit_message>
feat: rilis v0.16.3 dan perbaiki dokumen pendamping ASN
</commit_message>
<xml_diff>
--- a/legacy/sips_app/resources/templates/SPD_DPRD.docx
+++ b/legacy/sips_app/resources/templates/SPD_DPRD.docx
@@ -417,33 +417,12 @@
             </w:pPr>
             <w:r>
               <w:rPr>
-                <w:rFonts w:ascii="Arial" w:eastAsia="Calibri" w:hAnsi="Arial" w:cs="Arial"/>
-                <w:b/>
+                <w:rFonts w:ascii="Arial" w:hAnsi="Arial"/>
+                <w:b w:val="0"/>
                 <w:sz w:val="24"/>
-                <w:szCs w:val="24"/>
-                <w:lang w:val="sv-SE"/>
-              </w:rPr>
-              <w:t>{{</w:t>
-            </w:r>
-            <w:r>
-              <w:rPr>
-                <w:rFonts w:ascii="Arial" w:eastAsia="Calibri" w:hAnsi="Arial" w:cs="Arial"/>
-                <w:b/>
-                <w:sz w:val="24"/>
-                <w:szCs w:val="24"/>
-                <w:lang w:val="sv-SE"/>
-              </w:rPr>
-              <w:t>pelaksana_dprd_sppd</w:t>
-            </w:r>
-            <w:r>
-              <w:rPr>
-                <w:rFonts w:ascii="Arial" w:eastAsia="Calibri" w:hAnsi="Arial" w:cs="Arial"/>
-                <w:b/>
-                <w:sz w:val="24"/>
-                <w:szCs w:val="24"/>
-                <w:lang w:val="sv-SE"/>
-              </w:rPr>
-              <w:t>}}</w:t>
+                <w:u w:val="none"/>
+              </w:rPr>
+              <w:t>{{r pelaksana_sppd_rich}}</w:t>
             </w:r>
           </w:p>
         </w:tc>
@@ -721,106 +700,16 @@
                 <w:lang w:val="sv-SE"/>
               </w:rPr>
             </w:pPr>
-            <w:r>
-              <w:rPr>
-                <w:rFonts w:ascii="Arial" w:eastAsia="Calibri" w:hAnsi="Arial" w:cs="Arial"/>
-                <w:sz w:val="22"/>
-                <w:szCs w:val="24"/>
-                <w:lang w:val="sv-SE"/>
-              </w:rPr>
-              <w:t xml:space="preserve">Melakukan </w:t>
-            </w:r>
-            <w:r>
-              <w:rPr>
-                <w:rFonts w:ascii="Arial" w:hAnsi="Arial" w:cs="Arial"/>
-                <w:sz w:val="24"/>
-                <w:szCs w:val="24"/>
-              </w:rPr>
-              <w:t>{{</w:t>
-            </w:r>
-            <w:r>
-              <w:rPr>
-                <w:rFonts w:ascii="Arial" w:hAnsi="Arial" w:cs="Arial"/>
-                <w:sz w:val="24"/>
-                <w:szCs w:val="24"/>
-              </w:rPr>
-              <w:t>jenis_perjalanan</w:t>
-            </w:r>
-            <w:r>
-              <w:rPr>
-                <w:rFonts w:ascii="Arial" w:hAnsi="Arial" w:cs="Arial"/>
-                <w:sz w:val="24"/>
-                <w:szCs w:val="24"/>
-              </w:rPr>
-              <w:t>_sppd</w:t>
-            </w:r>
-            <w:r>
-              <w:rPr>
-                <w:rFonts w:ascii="Arial" w:hAnsi="Arial" w:cs="Arial"/>
-                <w:sz w:val="24"/>
-                <w:szCs w:val="24"/>
-              </w:rPr>
-              <w:t>}}</w:t>
-            </w:r>
-            <w:r>
-              <w:rPr>
-                <w:rFonts w:ascii="Arial" w:eastAsia="Calibri" w:hAnsi="Arial" w:cs="Arial"/>
-                <w:sz w:val="22"/>
-                <w:szCs w:val="24"/>
-                <w:lang w:val="sv-SE"/>
-              </w:rPr>
-              <w:t xml:space="preserve"> dalam rangka </w:t>
-            </w:r>
-            <w:r>
-              <w:rPr>
-                <w:rFonts w:ascii="Arial" w:hAnsi="Arial" w:cs="Arial"/>
-                <w:sz w:val="24"/>
-                <w:szCs w:val="24"/>
-              </w:rPr>
-              <w:t>{{</w:t>
-            </w:r>
-            <w:r>
-              <w:rPr>
-                <w:rFonts w:ascii="Arial" w:hAnsi="Arial" w:cs="Arial"/>
-                <w:sz w:val="24"/>
-                <w:szCs w:val="24"/>
-              </w:rPr>
-              <w:t>materi_tug</w:t>
-            </w:r>
             <w:bookmarkStart w:id="0" w:name="_GoBack"/>
             <w:bookmarkEnd w:id="0"/>
             <w:r>
               <w:rPr>
-                <w:rFonts w:ascii="Arial" w:hAnsi="Arial" w:cs="Arial"/>
+                <w:rFonts w:ascii="Arial" w:hAnsi="Arial"/>
+                <w:b w:val="0"/>
                 <w:sz w:val="24"/>
-                <w:szCs w:val="24"/>
-              </w:rPr>
-              <w:t>as</w:t>
-            </w:r>
-            <w:r>
-              <w:rPr>
-                <w:rFonts w:ascii="Arial" w:hAnsi="Arial" w:cs="Arial"/>
-                <w:sz w:val="24"/>
-                <w:szCs w:val="24"/>
-              </w:rPr>
-              <w:t>_sppd</w:t>
-            </w:r>
-            <w:r>
-              <w:rPr>
-                <w:rFonts w:ascii="Arial" w:hAnsi="Arial" w:cs="Arial"/>
-                <w:sz w:val="24"/>
-                <w:szCs w:val="24"/>
-              </w:rPr>
-              <w:t>}}</w:t>
-            </w:r>
-            <w:r>
-              <w:rPr>
-                <w:rFonts w:ascii="Arial" w:eastAsia="Calibri" w:hAnsi="Arial" w:cs="Arial"/>
-                <w:sz w:val="22"/>
-                <w:szCs w:val="24"/>
-                <w:lang w:val="sv-SE"/>
-              </w:rPr>
-              <w:t>.</w:t>
+                <w:u w:val="none"/>
+              </w:rPr>
+              <w:t>{{maksud_perjalanan_sppd}}.</w:t>
             </w:r>
           </w:p>
         </w:tc>

</xml_diff>